<commit_message>
Add Supabase vs alternatives justification to report Chapter 6
Co-Authored-By: Claude Sonnet 5 <noreply@anthropic.com>
</commit_message>
<xml_diff>
--- a/docs/BaoCao_SmartCityBusAssistant.docx
+++ b/docs/BaoCao_SmartCityBusAssistant.docx
@@ -1006,7 +1006,7 @@
     </w:p>
     <w:tbl>
       <w:tblPr>
-        <w:tblW w:type="dxa" w:w="11400"/>
+        <w:tblW w:type="dxa" w:w="9200"/>
         <w:tblBorders>
           <w:top w:val="single" w:color="auto" w:sz="4"/>
           <w:left w:val="single" w:color="auto" w:sz="4"/>
@@ -1017,11 +1017,11 @@
         </w:tblBorders>
       </w:tblPr>
       <w:tblGrid>
-        <w:gridCol w:w="2400"/>
-        <w:gridCol w:w="2600"/>
-        <w:gridCol w:w="2600"/>
-        <w:gridCol w:w="1600"/>
-        <w:gridCol w:w="2200"/>
+        <w:gridCol w:w="1900"/>
+        <w:gridCol w:w="2100"/>
+        <w:gridCol w:w="2100"/>
+        <w:gridCol w:w="1300"/>
+        <w:gridCol w:w="1800"/>
       </w:tblGrid>
       <w:tr>
         <w:trPr>
@@ -1029,7 +1029,7 @@
         </w:trPr>
         <w:tc>
           <w:tcPr>
-            <w:tcW w:type="dxa" w:w="2400"/>
+            <w:tcW w:type="dxa" w:w="1900"/>
             <w:shd w:fill="DBEAFE" w:val="clear"/>
             <w:tcMar>
               <w:top w:type="dxa" w:w="80"/>
@@ -1050,7 +1050,7 @@
         </w:tc>
         <w:tc>
           <w:tcPr>
-            <w:tcW w:type="dxa" w:w="2600"/>
+            <w:tcW w:type="dxa" w:w="2100"/>
             <w:shd w:fill="DBEAFE" w:val="clear"/>
             <w:tcMar>
               <w:top w:type="dxa" w:w="80"/>
@@ -1071,7 +1071,7 @@
         </w:tc>
         <w:tc>
           <w:tcPr>
-            <w:tcW w:type="dxa" w:w="2600"/>
+            <w:tcW w:type="dxa" w:w="2100"/>
             <w:shd w:fill="DBEAFE" w:val="clear"/>
             <w:tcMar>
               <w:top w:type="dxa" w:w="80"/>
@@ -1092,7 +1092,7 @@
         </w:tc>
         <w:tc>
           <w:tcPr>
-            <w:tcW w:type="dxa" w:w="1600"/>
+            <w:tcW w:type="dxa" w:w="1300"/>
             <w:shd w:fill="DBEAFE" w:val="clear"/>
             <w:tcMar>
               <w:top w:type="dxa" w:w="80"/>
@@ -1113,7 +1113,7 @@
         </w:tc>
         <w:tc>
           <w:tcPr>
-            <w:tcW w:type="dxa" w:w="2200"/>
+            <w:tcW w:type="dxa" w:w="1800"/>
             <w:shd w:fill="DBEAFE" w:val="clear"/>
             <w:tcMar>
               <w:top w:type="dxa" w:w="80"/>
@@ -1136,7 +1136,7 @@
       <w:tr>
         <w:tc>
           <w:tcPr>
-            <w:tcW w:type="dxa" w:w="2400"/>
+            <w:tcW w:type="dxa" w:w="1900"/>
             <w:tcMar>
               <w:top w:type="dxa" w:w="80"/>
               <w:left w:type="dxa" w:w="100"/>
@@ -1156,7 +1156,7 @@
         </w:tc>
         <w:tc>
           <w:tcPr>
-            <w:tcW w:type="dxa" w:w="2600"/>
+            <w:tcW w:type="dxa" w:w="2100"/>
             <w:tcMar>
               <w:top w:type="dxa" w:w="80"/>
               <w:left w:type="dxa" w:w="100"/>
@@ -1176,7 +1176,7 @@
         </w:tc>
         <w:tc>
           <w:tcPr>
-            <w:tcW w:type="dxa" w:w="2600"/>
+            <w:tcW w:type="dxa" w:w="2100"/>
             <w:tcMar>
               <w:top w:type="dxa" w:w="80"/>
               <w:left w:type="dxa" w:w="100"/>
@@ -1196,7 +1196,7 @@
         </w:tc>
         <w:tc>
           <w:tcPr>
-            <w:tcW w:type="dxa" w:w="1600"/>
+            <w:tcW w:type="dxa" w:w="1300"/>
             <w:tcMar>
               <w:top w:type="dxa" w:w="80"/>
               <w:left w:type="dxa" w:w="100"/>
@@ -1216,7 +1216,7 @@
         </w:tc>
         <w:tc>
           <w:tcPr>
-            <w:tcW w:type="dxa" w:w="2200"/>
+            <w:tcW w:type="dxa" w:w="1800"/>
             <w:tcMar>
               <w:top w:type="dxa" w:w="80"/>
               <w:left w:type="dxa" w:w="100"/>
@@ -1238,7 +1238,7 @@
       <w:tr>
         <w:tc>
           <w:tcPr>
-            <w:tcW w:type="dxa" w:w="2400"/>
+            <w:tcW w:type="dxa" w:w="1900"/>
             <w:tcMar>
               <w:top w:type="dxa" w:w="80"/>
               <w:left w:type="dxa" w:w="100"/>
@@ -1258,7 +1258,7 @@
         </w:tc>
         <w:tc>
           <w:tcPr>
-            <w:tcW w:type="dxa" w:w="2600"/>
+            <w:tcW w:type="dxa" w:w="2100"/>
             <w:tcMar>
               <w:top w:type="dxa" w:w="80"/>
               <w:left w:type="dxa" w:w="100"/>
@@ -1278,7 +1278,7 @@
         </w:tc>
         <w:tc>
           <w:tcPr>
-            <w:tcW w:type="dxa" w:w="2600"/>
+            <w:tcW w:type="dxa" w:w="2100"/>
             <w:tcMar>
               <w:top w:type="dxa" w:w="80"/>
               <w:left w:type="dxa" w:w="100"/>
@@ -1298,7 +1298,7 @@
         </w:tc>
         <w:tc>
           <w:tcPr>
-            <w:tcW w:type="dxa" w:w="1600"/>
+            <w:tcW w:type="dxa" w:w="1300"/>
             <w:tcMar>
               <w:top w:type="dxa" w:w="80"/>
               <w:left w:type="dxa" w:w="100"/>
@@ -1318,7 +1318,7 @@
         </w:tc>
         <w:tc>
           <w:tcPr>
-            <w:tcW w:type="dxa" w:w="2200"/>
+            <w:tcW w:type="dxa" w:w="1800"/>
             <w:tcMar>
               <w:top w:type="dxa" w:w="80"/>
               <w:left w:type="dxa" w:w="100"/>
@@ -1340,7 +1340,7 @@
       <w:tr>
         <w:tc>
           <w:tcPr>
-            <w:tcW w:type="dxa" w:w="2400"/>
+            <w:tcW w:type="dxa" w:w="1900"/>
             <w:tcMar>
               <w:top w:type="dxa" w:w="80"/>
               <w:left w:type="dxa" w:w="100"/>
@@ -1360,7 +1360,7 @@
         </w:tc>
         <w:tc>
           <w:tcPr>
-            <w:tcW w:type="dxa" w:w="2600"/>
+            <w:tcW w:type="dxa" w:w="2100"/>
             <w:tcMar>
               <w:top w:type="dxa" w:w="80"/>
               <w:left w:type="dxa" w:w="100"/>
@@ -1380,7 +1380,7 @@
         </w:tc>
         <w:tc>
           <w:tcPr>
-            <w:tcW w:type="dxa" w:w="2600"/>
+            <w:tcW w:type="dxa" w:w="2100"/>
             <w:tcMar>
               <w:top w:type="dxa" w:w="80"/>
               <w:left w:type="dxa" w:w="100"/>
@@ -1400,7 +1400,7 @@
         </w:tc>
         <w:tc>
           <w:tcPr>
-            <w:tcW w:type="dxa" w:w="1600"/>
+            <w:tcW w:type="dxa" w:w="1300"/>
             <w:tcMar>
               <w:top w:type="dxa" w:w="80"/>
               <w:left w:type="dxa" w:w="100"/>
@@ -1420,7 +1420,7 @@
         </w:tc>
         <w:tc>
           <w:tcPr>
-            <w:tcW w:type="dxa" w:w="2200"/>
+            <w:tcW w:type="dxa" w:w="1800"/>
             <w:tcMar>
               <w:top w:type="dxa" w:w="80"/>
               <w:left w:type="dxa" w:w="100"/>
@@ -1442,7 +1442,7 @@
       <w:tr>
         <w:tc>
           <w:tcPr>
-            <w:tcW w:type="dxa" w:w="2400"/>
+            <w:tcW w:type="dxa" w:w="1900"/>
             <w:tcMar>
               <w:top w:type="dxa" w:w="80"/>
               <w:left w:type="dxa" w:w="100"/>
@@ -1462,7 +1462,7 @@
         </w:tc>
         <w:tc>
           <w:tcPr>
-            <w:tcW w:type="dxa" w:w="2600"/>
+            <w:tcW w:type="dxa" w:w="2100"/>
             <w:tcMar>
               <w:top w:type="dxa" w:w="80"/>
               <w:left w:type="dxa" w:w="100"/>
@@ -1482,7 +1482,7 @@
         </w:tc>
         <w:tc>
           <w:tcPr>
-            <w:tcW w:type="dxa" w:w="2600"/>
+            <w:tcW w:type="dxa" w:w="2100"/>
             <w:tcMar>
               <w:top w:type="dxa" w:w="80"/>
               <w:left w:type="dxa" w:w="100"/>
@@ -1502,7 +1502,7 @@
         </w:tc>
         <w:tc>
           <w:tcPr>
-            <w:tcW w:type="dxa" w:w="1600"/>
+            <w:tcW w:type="dxa" w:w="1300"/>
             <w:tcMar>
               <w:top w:type="dxa" w:w="80"/>
               <w:left w:type="dxa" w:w="100"/>
@@ -1522,7 +1522,7 @@
         </w:tc>
         <w:tc>
           <w:tcPr>
-            <w:tcW w:type="dxa" w:w="2200"/>
+            <w:tcW w:type="dxa" w:w="1800"/>
             <w:tcMar>
               <w:top w:type="dxa" w:w="80"/>
               <w:left w:type="dxa" w:w="100"/>
@@ -4142,6 +4142,773 @@
       </w:pPr>
       <w:r>
         <w:t xml:space="preserve">Toàn bộ 4 bảng đều bật Row Level Security (RLS): chính sách đọc công khai (public select) cho cả 4 bảng, chính sách ghi công khai (public insert) chỉ áp dụng cho bảng search_logs (dữ liệu không nhạy cảm); khoá service_role (toàn quyền ghi/xoá) chỉ dùng cục bộ khi nạp dữ liệu, không đưa vào phía client.</w:t>
+      </w:r>
+    </w:p>
+    <w:p>
+      <w:pPr>
+        <w:pStyle w:val="Heading2"/>
+        <w:spacing w:after="140" w:before="280"/>
+      </w:pPr>
+      <w:r>
+        <w:t xml:space="preserve">6.6. Vì sao chọn Supabase làm Cloud Database (so với các lựa chọn khác)</w:t>
+      </w:r>
+    </w:p>
+    <w:p>
+      <w:pPr>
+        <w:spacing w:after="160" w:line="300"/>
+      </w:pPr>
+      <w:r>
+        <w:t xml:space="preserve">Dữ liệu của đồ án có tính QUAN HỆ rõ ràng: 1 tuyến có nhiều trạm, và quan trọng hơn - 1 trạm được NHIỀU tuyến khác nhau dùng chung (đây chính là cơ chế tạo ra "điểm trung chuyển" mà thuật toán gợi ý đổi tuyến phụ thuộc vào). Đây là mô hình khoá ngoại (foreign key) kinh điển, phù hợp cơ sở dữ liệu quan hệ (SQL) hơn là cơ sở dữ liệu dạng tài liệu (NoSQL) - nếu dùng NoSQL sẽ phải nhúng lồng danh sách trạm vào từng tuyến, làm mất tính "1 trạm - 1 nguồn sự thật duy nhất" và phá vỡ cơ chế phát hiện điểm chuyển tuyến.</w:t>
+      </w:r>
+    </w:p>
+    <w:tbl>
+      <w:tblPr>
+        <w:tblW w:type="dxa" w:w="9200"/>
+        <w:tblBorders>
+          <w:top w:val="single" w:color="auto" w:sz="4"/>
+          <w:left w:val="single" w:color="auto" w:sz="4"/>
+          <w:bottom w:val="single" w:color="auto" w:sz="4"/>
+          <w:right w:val="single" w:color="auto" w:sz="4"/>
+          <w:insideH w:val="single" w:color="auto" w:sz="4"/>
+          <w:insideV w:val="single" w:color="auto" w:sz="4"/>
+        </w:tblBorders>
+      </w:tblPr>
+      <w:tblGrid>
+        <w:gridCol w:w="2800"/>
+        <w:gridCol w:w="1500"/>
+        <w:gridCol w:w="1800"/>
+        <w:gridCol w:w="1500"/>
+        <w:gridCol w:w="1600"/>
+      </w:tblGrid>
+      <w:tr>
+        <w:trPr>
+          <w:tblHeader/>
+        </w:trPr>
+        <w:tc>
+          <w:tcPr>
+            <w:tcW w:type="dxa" w:w="2800"/>
+            <w:shd w:fill="DBEAFE" w:val="clear"/>
+            <w:tcMar>
+              <w:top w:type="dxa" w:w="80"/>
+              <w:left w:type="dxa" w:w="100"/>
+              <w:bottom w:type="dxa" w:w="80"/>
+              <w:right w:type="dxa" w:w="100"/>
+            </w:tcMar>
+          </w:tcPr>
+          <w:p>
+            <w:r>
+              <w:rPr>
+                <w:b/>
+                <w:bCs/>
+              </w:rPr>
+              <w:t xml:space="preserve">Tiêu chí</w:t>
+            </w:r>
+          </w:p>
+        </w:tc>
+        <w:tc>
+          <w:tcPr>
+            <w:tcW w:type="dxa" w:w="1500"/>
+            <w:shd w:fill="DBEAFE" w:val="clear"/>
+            <w:tcMar>
+              <w:top w:type="dxa" w:w="80"/>
+              <w:left w:type="dxa" w:w="100"/>
+              <w:bottom w:type="dxa" w:w="80"/>
+              <w:right w:type="dxa" w:w="100"/>
+            </w:tcMar>
+          </w:tcPr>
+          <w:p>
+            <w:r>
+              <w:rPr>
+                <w:b/>
+                <w:bCs/>
+              </w:rPr>
+              <w:t xml:space="preserve">Supabase</w:t>
+            </w:r>
+          </w:p>
+        </w:tc>
+        <w:tc>
+          <w:tcPr>
+            <w:tcW w:type="dxa" w:w="1800"/>
+            <w:shd w:fill="DBEAFE" w:val="clear"/>
+            <w:tcMar>
+              <w:top w:type="dxa" w:w="80"/>
+              <w:left w:type="dxa" w:w="100"/>
+              <w:bottom w:type="dxa" w:w="80"/>
+              <w:right w:type="dxa" w:w="100"/>
+            </w:tcMar>
+          </w:tcPr>
+          <w:p>
+            <w:r>
+              <w:rPr>
+                <w:b/>
+                <w:bCs/>
+              </w:rPr>
+              <w:t xml:space="preserve">Firebase / MongoDB (NoSQL)</w:t>
+            </w:r>
+          </w:p>
+        </w:tc>
+        <w:tc>
+          <w:tcPr>
+            <w:tcW w:type="dxa" w:w="1500"/>
+            <w:shd w:fill="DBEAFE" w:val="clear"/>
+            <w:tcMar>
+              <w:top w:type="dxa" w:w="80"/>
+              <w:left w:type="dxa" w:w="100"/>
+              <w:bottom w:type="dxa" w:w="80"/>
+              <w:right w:type="dxa" w:w="100"/>
+            </w:tcMar>
+          </w:tcPr>
+          <w:p>
+            <w:r>
+              <w:rPr>
+                <w:b/>
+                <w:bCs/>
+              </w:rPr>
+              <w:t xml:space="preserve">AWS RDS / Cloud SQL</w:t>
+            </w:r>
+          </w:p>
+        </w:tc>
+        <w:tc>
+          <w:tcPr>
+            <w:tcW w:type="dxa" w:w="1600"/>
+            <w:shd w:fill="DBEAFE" w:val="clear"/>
+            <w:tcMar>
+              <w:top w:type="dxa" w:w="80"/>
+              <w:left w:type="dxa" w:w="100"/>
+              <w:bottom w:type="dxa" w:w="80"/>
+              <w:right w:type="dxa" w:w="100"/>
+            </w:tcMar>
+          </w:tcPr>
+          <w:p>
+            <w:r>
+              <w:rPr>
+                <w:b/>
+                <w:bCs/>
+              </w:rPr>
+              <w:t xml:space="preserve">Tự host PostgreSQL (VPS)</w:t>
+            </w:r>
+          </w:p>
+        </w:tc>
+      </w:tr>
+      <w:tr>
+        <w:tc>
+          <w:tcPr>
+            <w:tcW w:type="dxa" w:w="2800"/>
+            <w:tcMar>
+              <w:top w:type="dxa" w:w="80"/>
+              <w:left w:type="dxa" w:w="100"/>
+              <w:bottom w:type="dxa" w:w="80"/>
+              <w:right w:type="dxa" w:w="100"/>
+            </w:tcMar>
+          </w:tcPr>
+          <w:p>
+            <w:r>
+              <w:rPr>
+                <w:b w:val="false"/>
+                <w:bCs w:val="false"/>
+              </w:rPr>
+              <w:t xml:space="preserve">Phù hợp dữ liệu quan hệ (khoá ngoại routes↔stops)</w:t>
+            </w:r>
+          </w:p>
+        </w:tc>
+        <w:tc>
+          <w:tcPr>
+            <w:tcW w:type="dxa" w:w="1500"/>
+            <w:tcMar>
+              <w:top w:type="dxa" w:w="80"/>
+              <w:left w:type="dxa" w:w="100"/>
+              <w:bottom w:type="dxa" w:w="80"/>
+              <w:right w:type="dxa" w:w="100"/>
+            </w:tcMar>
+          </w:tcPr>
+          <w:p>
+            <w:r>
+              <w:rPr>
+                <w:b w:val="false"/>
+                <w:bCs w:val="false"/>
+              </w:rPr>
+              <w:t xml:space="preserve">Có - PostgreSQL thật</w:t>
+            </w:r>
+          </w:p>
+        </w:tc>
+        <w:tc>
+          <w:tcPr>
+            <w:tcW w:type="dxa" w:w="1800"/>
+            <w:tcMar>
+              <w:top w:type="dxa" w:w="80"/>
+              <w:left w:type="dxa" w:w="100"/>
+              <w:bottom w:type="dxa" w:w="80"/>
+              <w:right w:type="dxa" w:w="100"/>
+            </w:tcMar>
+          </w:tcPr>
+          <w:p>
+            <w:r>
+              <w:rPr>
+                <w:b w:val="false"/>
+                <w:bCs w:val="false"/>
+              </w:rPr>
+              <w:t xml:space="preserve">Không - phải nhúng lồng, mất tính dùng chung</w:t>
+            </w:r>
+          </w:p>
+        </w:tc>
+        <w:tc>
+          <w:tcPr>
+            <w:tcW w:type="dxa" w:w="1500"/>
+            <w:tcMar>
+              <w:top w:type="dxa" w:w="80"/>
+              <w:left w:type="dxa" w:w="100"/>
+              <w:bottom w:type="dxa" w:w="80"/>
+              <w:right w:type="dxa" w:w="100"/>
+            </w:tcMar>
+          </w:tcPr>
+          <w:p>
+            <w:r>
+              <w:rPr>
+                <w:b w:val="false"/>
+                <w:bCs w:val="false"/>
+              </w:rPr>
+              <w:t xml:space="preserve">Có - PostgreSQL/MySQL thật</w:t>
+            </w:r>
+          </w:p>
+        </w:tc>
+        <w:tc>
+          <w:tcPr>
+            <w:tcW w:type="dxa" w:w="1600"/>
+            <w:tcMar>
+              <w:top w:type="dxa" w:w="80"/>
+              <w:left w:type="dxa" w:w="100"/>
+              <w:bottom w:type="dxa" w:w="80"/>
+              <w:right w:type="dxa" w:w="100"/>
+            </w:tcMar>
+          </w:tcPr>
+          <w:p>
+            <w:r>
+              <w:rPr>
+                <w:b w:val="false"/>
+                <w:bCs w:val="false"/>
+              </w:rPr>
+              <w:t xml:space="preserve">Có - PostgreSQL thật</w:t>
+            </w:r>
+          </w:p>
+        </w:tc>
+      </w:tr>
+      <w:tr>
+        <w:tc>
+          <w:tcPr>
+            <w:tcW w:type="dxa" w:w="2800"/>
+            <w:tcMar>
+              <w:top w:type="dxa" w:w="80"/>
+              <w:left w:type="dxa" w:w="100"/>
+              <w:bottom w:type="dxa" w:w="80"/>
+              <w:right w:type="dxa" w:w="100"/>
+            </w:tcMar>
+          </w:tcPr>
+          <w:p>
+            <w:r>
+              <w:rPr>
+                <w:b w:val="false"/>
+                <w:bCs w:val="false"/>
+              </w:rPr>
+              <w:t xml:space="preserve">Tự sinh REST API (không cần viết backend riêng)</w:t>
+            </w:r>
+          </w:p>
+        </w:tc>
+        <w:tc>
+          <w:tcPr>
+            <w:tcW w:type="dxa" w:w="1500"/>
+            <w:tcMar>
+              <w:top w:type="dxa" w:w="80"/>
+              <w:left w:type="dxa" w:w="100"/>
+              <w:bottom w:type="dxa" w:w="80"/>
+              <w:right w:type="dxa" w:w="100"/>
+            </w:tcMar>
+          </w:tcPr>
+          <w:p>
+            <w:r>
+              <w:rPr>
+                <w:b w:val="false"/>
+                <w:bCs w:val="false"/>
+              </w:rPr>
+              <w:t xml:space="preserve">Có - PostgREST tự động</w:t>
+            </w:r>
+          </w:p>
+        </w:tc>
+        <w:tc>
+          <w:tcPr>
+            <w:tcW w:type="dxa" w:w="1800"/>
+            <w:tcMar>
+              <w:top w:type="dxa" w:w="80"/>
+              <w:left w:type="dxa" w:w="100"/>
+              <w:bottom w:type="dxa" w:w="80"/>
+              <w:right w:type="dxa" w:w="100"/>
+            </w:tcMar>
+          </w:tcPr>
+          <w:p>
+            <w:r>
+              <w:rPr>
+                <w:b w:val="false"/>
+                <w:bCs w:val="false"/>
+              </w:rPr>
+              <w:t xml:space="preserve">Cần viết Cloud Functions / bật Data API riêng</w:t>
+            </w:r>
+          </w:p>
+        </w:tc>
+        <w:tc>
+          <w:tcPr>
+            <w:tcW w:type="dxa" w:w="1500"/>
+            <w:tcMar>
+              <w:top w:type="dxa" w:w="80"/>
+              <w:left w:type="dxa" w:w="100"/>
+              <w:bottom w:type="dxa" w:w="80"/>
+              <w:right w:type="dxa" w:w="100"/>
+            </w:tcMar>
+          </w:tcPr>
+          <w:p>
+            <w:r>
+              <w:rPr>
+                <w:b w:val="false"/>
+                <w:bCs w:val="false"/>
+              </w:rPr>
+              <w:t xml:space="preserve">Không - phải tự dựng API Gateway/Lambda</w:t>
+            </w:r>
+          </w:p>
+        </w:tc>
+        <w:tc>
+          <w:tcPr>
+            <w:tcW w:type="dxa" w:w="1600"/>
+            <w:tcMar>
+              <w:top w:type="dxa" w:w="80"/>
+              <w:left w:type="dxa" w:w="100"/>
+              <w:bottom w:type="dxa" w:w="80"/>
+              <w:right w:type="dxa" w:w="100"/>
+            </w:tcMar>
+          </w:tcPr>
+          <w:p>
+            <w:r>
+              <w:rPr>
+                <w:b w:val="false"/>
+                <w:bCs w:val="false"/>
+              </w:rPr>
+              <w:t xml:space="preserve">Không - phải tự viết toàn bộ</w:t>
+            </w:r>
+          </w:p>
+        </w:tc>
+      </w:tr>
+      <w:tr>
+        <w:tc>
+          <w:tcPr>
+            <w:tcW w:type="dxa" w:w="2800"/>
+            <w:tcMar>
+              <w:top w:type="dxa" w:w="80"/>
+              <w:left w:type="dxa" w:w="100"/>
+              <w:bottom w:type="dxa" w:w="80"/>
+              <w:right w:type="dxa" w:w="100"/>
+            </w:tcMar>
+          </w:tcPr>
+          <w:p>
+            <w:r>
+              <w:rPr>
+                <w:b w:val="false"/>
+                <w:bCs w:val="false"/>
+              </w:rPr>
+              <w:t xml:space="preserve">Bảo mật phân quyền (Row Level Security) có sẵn</w:t>
+            </w:r>
+          </w:p>
+        </w:tc>
+        <w:tc>
+          <w:tcPr>
+            <w:tcW w:type="dxa" w:w="1500"/>
+            <w:tcMar>
+              <w:top w:type="dxa" w:w="80"/>
+              <w:left w:type="dxa" w:w="100"/>
+              <w:bottom w:type="dxa" w:w="80"/>
+              <w:right w:type="dxa" w:w="100"/>
+            </w:tcMar>
+          </w:tcPr>
+          <w:p>
+            <w:r>
+              <w:rPr>
+                <w:b w:val="false"/>
+                <w:bCs w:val="false"/>
+              </w:rPr>
+              <w:t xml:space="preserve">Có - tích hợp sẵn</w:t>
+            </w:r>
+          </w:p>
+        </w:tc>
+        <w:tc>
+          <w:tcPr>
+            <w:tcW w:type="dxa" w:w="1800"/>
+            <w:tcMar>
+              <w:top w:type="dxa" w:w="80"/>
+              <w:left w:type="dxa" w:w="100"/>
+              <w:bottom w:type="dxa" w:w="80"/>
+              <w:right w:type="dxa" w:w="100"/>
+            </w:tcMar>
+          </w:tcPr>
+          <w:p>
+            <w:r>
+              <w:rPr>
+                <w:b w:val="false"/>
+                <w:bCs w:val="false"/>
+              </w:rPr>
+              <w:t xml:space="preserve">Có (Security Rules) nhưng cú pháp riêng biệt</w:t>
+            </w:r>
+          </w:p>
+        </w:tc>
+        <w:tc>
+          <w:tcPr>
+            <w:tcW w:type="dxa" w:w="1500"/>
+            <w:tcMar>
+              <w:top w:type="dxa" w:w="80"/>
+              <w:left w:type="dxa" w:w="100"/>
+              <w:bottom w:type="dxa" w:w="80"/>
+              <w:right w:type="dxa" w:w="100"/>
+            </w:tcMar>
+          </w:tcPr>
+          <w:p>
+            <w:r>
+              <w:rPr>
+                <w:b w:val="false"/>
+                <w:bCs w:val="false"/>
+              </w:rPr>
+              <w:t xml:space="preserve">Không - phải tự cấu hình IAM</w:t>
+            </w:r>
+          </w:p>
+        </w:tc>
+        <w:tc>
+          <w:tcPr>
+            <w:tcW w:type="dxa" w:w="1600"/>
+            <w:tcMar>
+              <w:top w:type="dxa" w:w="80"/>
+              <w:left w:type="dxa" w:w="100"/>
+              <w:bottom w:type="dxa" w:w="80"/>
+              <w:right w:type="dxa" w:w="100"/>
+            </w:tcMar>
+          </w:tcPr>
+          <w:p>
+            <w:r>
+              <w:rPr>
+                <w:b w:val="false"/>
+                <w:bCs w:val="false"/>
+              </w:rPr>
+              <w:t xml:space="preserve">Không - tự cấu hình toàn bộ</w:t>
+            </w:r>
+          </w:p>
+        </w:tc>
+      </w:tr>
+      <w:tr>
+        <w:tc>
+          <w:tcPr>
+            <w:tcW w:type="dxa" w:w="2800"/>
+            <w:tcMar>
+              <w:top w:type="dxa" w:w="80"/>
+              <w:left w:type="dxa" w:w="100"/>
+              <w:bottom w:type="dxa" w:w="80"/>
+              <w:right w:type="dxa" w:w="100"/>
+            </w:tcMar>
+          </w:tcPr>
+          <w:p>
+            <w:r>
+              <w:rPr>
+                <w:b w:val="false"/>
+                <w:bCs w:val="false"/>
+              </w:rPr>
+              <w:t xml:space="preserve">Gói miễn phí vĩnh viễn</w:t>
+            </w:r>
+          </w:p>
+        </w:tc>
+        <w:tc>
+          <w:tcPr>
+            <w:tcW w:type="dxa" w:w="1500"/>
+            <w:tcMar>
+              <w:top w:type="dxa" w:w="80"/>
+              <w:left w:type="dxa" w:w="100"/>
+              <w:bottom w:type="dxa" w:w="80"/>
+              <w:right w:type="dxa" w:w="100"/>
+            </w:tcMar>
+          </w:tcPr>
+          <w:p>
+            <w:r>
+              <w:rPr>
+                <w:b w:val="false"/>
+                <w:bCs w:val="false"/>
+              </w:rPr>
+              <w:t xml:space="preserve">Có (500MB DB / 1GB Storage / 50k MAU)</w:t>
+            </w:r>
+          </w:p>
+        </w:tc>
+        <w:tc>
+          <w:tcPr>
+            <w:tcW w:type="dxa" w:w="1800"/>
+            <w:tcMar>
+              <w:top w:type="dxa" w:w="80"/>
+              <w:left w:type="dxa" w:w="100"/>
+              <w:bottom w:type="dxa" w:w="80"/>
+              <w:right w:type="dxa" w:w="100"/>
+            </w:tcMar>
+          </w:tcPr>
+          <w:p>
+            <w:r>
+              <w:rPr>
+                <w:b w:val="false"/>
+                <w:bCs w:val="false"/>
+              </w:rPr>
+              <w:t xml:space="preserve">Có (giới hạn thấp hơn)</w:t>
+            </w:r>
+          </w:p>
+        </w:tc>
+        <w:tc>
+          <w:tcPr>
+            <w:tcW w:type="dxa" w:w="1500"/>
+            <w:tcMar>
+              <w:top w:type="dxa" w:w="80"/>
+              <w:left w:type="dxa" w:w="100"/>
+              <w:bottom w:type="dxa" w:w="80"/>
+              <w:right w:type="dxa" w:w="100"/>
+            </w:tcMar>
+          </w:tcPr>
+          <w:p>
+            <w:r>
+              <w:rPr>
+                <w:b w:val="false"/>
+                <w:bCs w:val="false"/>
+              </w:rPr>
+              <w:t xml:space="preserve">Không - chỉ free 12 tháng đầu</w:t>
+            </w:r>
+          </w:p>
+        </w:tc>
+        <w:tc>
+          <w:tcPr>
+            <w:tcW w:type="dxa" w:w="1600"/>
+            <w:tcMar>
+              <w:top w:type="dxa" w:w="80"/>
+              <w:left w:type="dxa" w:w="100"/>
+              <w:bottom w:type="dxa" w:w="80"/>
+              <w:right w:type="dxa" w:w="100"/>
+            </w:tcMar>
+          </w:tcPr>
+          <w:p>
+            <w:r>
+              <w:rPr>
+                <w:b w:val="false"/>
+                <w:bCs w:val="false"/>
+              </w:rPr>
+              <w:t xml:space="preserve">Thường có phí VPS hàng tháng</w:t>
+            </w:r>
+          </w:p>
+        </w:tc>
+      </w:tr>
+      <w:tr>
+        <w:tc>
+          <w:tcPr>
+            <w:tcW w:type="dxa" w:w="2800"/>
+            <w:tcMar>
+              <w:top w:type="dxa" w:w="80"/>
+              <w:left w:type="dxa" w:w="100"/>
+              <w:bottom w:type="dxa" w:w="80"/>
+              <w:right w:type="dxa" w:w="100"/>
+            </w:tcMar>
+          </w:tcPr>
+          <w:p>
+            <w:r>
+              <w:rPr>
+                <w:b w:val="false"/>
+                <w:bCs w:val="false"/>
+              </w:rPr>
+              <w:t xml:space="preserve">Kèm sẵn Cloud Storage cùng nền tảng</w:t>
+            </w:r>
+          </w:p>
+        </w:tc>
+        <w:tc>
+          <w:tcPr>
+            <w:tcW w:type="dxa" w:w="1500"/>
+            <w:tcMar>
+              <w:top w:type="dxa" w:w="80"/>
+              <w:left w:type="dxa" w:w="100"/>
+              <w:bottom w:type="dxa" w:w="80"/>
+              <w:right w:type="dxa" w:w="100"/>
+            </w:tcMar>
+          </w:tcPr>
+          <w:p>
+            <w:r>
+              <w:rPr>
+                <w:b w:val="false"/>
+                <w:bCs w:val="false"/>
+              </w:rPr>
+              <w:t xml:space="preserve">Có</w:t>
+            </w:r>
+          </w:p>
+        </w:tc>
+        <w:tc>
+          <w:tcPr>
+            <w:tcW w:type="dxa" w:w="1800"/>
+            <w:tcMar>
+              <w:top w:type="dxa" w:w="80"/>
+              <w:left w:type="dxa" w:w="100"/>
+              <w:bottom w:type="dxa" w:w="80"/>
+              <w:right w:type="dxa" w:w="100"/>
+            </w:tcMar>
+          </w:tcPr>
+          <w:p>
+            <w:r>
+              <w:rPr>
+                <w:b w:val="false"/>
+                <w:bCs w:val="false"/>
+              </w:rPr>
+              <w:t xml:space="preserve">Có</w:t>
+            </w:r>
+          </w:p>
+        </w:tc>
+        <w:tc>
+          <w:tcPr>
+            <w:tcW w:type="dxa" w:w="1500"/>
+            <w:tcMar>
+              <w:top w:type="dxa" w:w="80"/>
+              <w:left w:type="dxa" w:w="100"/>
+              <w:bottom w:type="dxa" w:w="80"/>
+              <w:right w:type="dxa" w:w="100"/>
+            </w:tcMar>
+          </w:tcPr>
+          <w:p>
+            <w:r>
+              <w:rPr>
+                <w:b w:val="false"/>
+                <w:bCs w:val="false"/>
+              </w:rPr>
+              <w:t xml:space="preserve">Không - cần dịch vụ Storage riêng (S3...)</w:t>
+            </w:r>
+          </w:p>
+        </w:tc>
+        <w:tc>
+          <w:tcPr>
+            <w:tcW w:type="dxa" w:w="1600"/>
+            <w:tcMar>
+              <w:top w:type="dxa" w:w="80"/>
+              <w:left w:type="dxa" w:w="100"/>
+              <w:bottom w:type="dxa" w:w="80"/>
+              <w:right w:type="dxa" w:w="100"/>
+            </w:tcMar>
+          </w:tcPr>
+          <w:p>
+            <w:r>
+              <w:rPr>
+                <w:b w:val="false"/>
+                <w:bCs w:val="false"/>
+              </w:rPr>
+              <w:t xml:space="preserve">Không - tự cấu hình riêng</w:t>
+            </w:r>
+          </w:p>
+        </w:tc>
+      </w:tr>
+      <w:tr>
+        <w:tc>
+          <w:tcPr>
+            <w:tcW w:type="dxa" w:w="2800"/>
+            <w:tcMar>
+              <w:top w:type="dxa" w:w="80"/>
+              <w:left w:type="dxa" w:w="100"/>
+              <w:bottom w:type="dxa" w:w="80"/>
+              <w:right w:type="dxa" w:w="100"/>
+            </w:tcMar>
+          </w:tcPr>
+          <w:p>
+            <w:r>
+              <w:rPr>
+                <w:b w:val="false"/>
+                <w:bCs w:val="false"/>
+              </w:rPr>
+              <w:t xml:space="preserve">Độ phức tạp triển khai (phù hợp lịch trình 5 buổi)</w:t>
+            </w:r>
+          </w:p>
+        </w:tc>
+        <w:tc>
+          <w:tcPr>
+            <w:tcW w:type="dxa" w:w="1500"/>
+            <w:tcMar>
+              <w:top w:type="dxa" w:w="80"/>
+              <w:left w:type="dxa" w:w="100"/>
+              <w:bottom w:type="dxa" w:w="80"/>
+              <w:right w:type="dxa" w:w="100"/>
+            </w:tcMar>
+          </w:tcPr>
+          <w:p>
+            <w:r>
+              <w:rPr>
+                <w:b w:val="false"/>
+                <w:bCs w:val="false"/>
+              </w:rPr>
+              <w:t xml:space="preserve">Thấp - tạo project, chạy 1 file SQL</w:t>
+            </w:r>
+          </w:p>
+        </w:tc>
+        <w:tc>
+          <w:tcPr>
+            <w:tcW w:type="dxa" w:w="1800"/>
+            <w:tcMar>
+              <w:top w:type="dxa" w:w="80"/>
+              <w:left w:type="dxa" w:w="100"/>
+              <w:bottom w:type="dxa" w:w="80"/>
+              <w:right w:type="dxa" w:w="100"/>
+            </w:tcMar>
+          </w:tcPr>
+          <w:p>
+            <w:r>
+              <w:rPr>
+                <w:b w:val="false"/>
+                <w:bCs w:val="false"/>
+              </w:rPr>
+              <w:t xml:space="preserve">Trung bình</w:t>
+            </w:r>
+          </w:p>
+        </w:tc>
+        <w:tc>
+          <w:tcPr>
+            <w:tcW w:type="dxa" w:w="1500"/>
+            <w:tcMar>
+              <w:top w:type="dxa" w:w="80"/>
+              <w:left w:type="dxa" w:w="100"/>
+              <w:bottom w:type="dxa" w:w="80"/>
+              <w:right w:type="dxa" w:w="100"/>
+            </w:tcMar>
+          </w:tcPr>
+          <w:p>
+            <w:r>
+              <w:rPr>
+                <w:b w:val="false"/>
+                <w:bCs w:val="false"/>
+              </w:rPr>
+              <w:t xml:space="preserve">Cao - cấu hình mạng/bảo mật</w:t>
+            </w:r>
+          </w:p>
+        </w:tc>
+        <w:tc>
+          <w:tcPr>
+            <w:tcW w:type="dxa" w:w="1600"/>
+            <w:tcMar>
+              <w:top w:type="dxa" w:w="80"/>
+              <w:left w:type="dxa" w:w="100"/>
+              <w:bottom w:type="dxa" w:w="80"/>
+              <w:right w:type="dxa" w:w="100"/>
+            </w:tcMar>
+          </w:tcPr>
+          <w:p>
+            <w:r>
+              <w:rPr>
+                <w:b w:val="false"/>
+                <w:bCs w:val="false"/>
+              </w:rPr>
+              <w:t xml:space="preserve">Rất cao - tự quản lý toàn bộ hạ tầng</w:t>
+            </w:r>
+          </w:p>
+        </w:tc>
+      </w:tr>
+    </w:tbl>
+    <w:p>
+      <w:pPr>
+        <w:spacing w:after="160" w:line="300"/>
+      </w:pPr>
+      <w:r>
+        <w:t xml:space="preserve">Kết luận: trong số các nền tảng PostgreSQL được quản lý sẵn (managed), Supabase là lựa chọn phù hợp nhất cho quy mô và thời hạn của đồ án học phần vì là nền tảng DUY NHẤT hội tụ đủ 4 yếu tố: cơ sở dữ liệu quan hệ thật, API REST tự sinh, bảo mật RLS tích hợp, và Cloud Storage đi kèm - trong khi AWS RDS/Google Cloud SQL không có gói miễn phí vĩnh viễn và cần tự xây thêm tầng API, còn Firebase/MongoDB (NoSQL) không phù hợp bản chất quan hệ của dữ liệu tuyến-trạm. Tự triển khai PostgreSQL trên VPS riêng bị loại vì đi ngược mục tiêu môn học: đó là tự quản lý hạ tầng thay vì khai thác dịch vụ Cloud có sẵn.</w:t>
       </w:r>
     </w:p>
     <w:p>

</xml_diff>